<commit_message>
Updated Favourites Screen doc with screenshot and other missing information
</commit_message>
<xml_diff>
--- a/artifacts/Component Documents/Favourites Screen/ClientCare Favourites Screen.docx
+++ b/artifacts/Component Documents/Favourites Screen/ClientCare Favourites Screen.docx
@@ -181,21 +181,12 @@
                 <w:sz w:val="16"/>
               </w:rPr>
             </w:pPr>
-            <w:proofErr w:type="spellStart"/>
-            <w:r>
-              <w:rPr>
-                <w:color w:val="000000" w:themeColor="text1"/>
-                <w:sz w:val="16"/>
-              </w:rPr>
-              <w:t>Morné</w:t>
-            </w:r>
-            <w:proofErr w:type="spellEnd"/>
-            <w:r>
-              <w:rPr>
-                <w:color w:val="000000" w:themeColor="text1"/>
-                <w:sz w:val="16"/>
-              </w:rPr>
-              <w:t xml:space="preserve"> Homan</w:t>
+            <w:r>
+              <w:rPr>
+                <w:color w:val="000000" w:themeColor="text1"/>
+                <w:sz w:val="16"/>
+              </w:rPr>
+              <w:t>Morné Homan</w:t>
             </w:r>
           </w:p>
         </w:tc>
@@ -268,17 +259,8 @@
                 <w:color w:val="000000" w:themeColor="text1"/>
                 <w:sz w:val="16"/>
               </w:rPr>
-              <w:t>#horizon #</w:t>
-            </w:r>
-            <w:proofErr w:type="spellStart"/>
-            <w:r>
-              <w:rPr>
-                <w:color w:val="000000" w:themeColor="text1"/>
-                <w:sz w:val="16"/>
-              </w:rPr>
-              <w:t>clientcare</w:t>
-            </w:r>
-            <w:proofErr w:type="spellEnd"/>
+              <w:t>#horizon #clientcare</w:t>
+            </w:r>
           </w:p>
         </w:tc>
       </w:tr>
@@ -508,21 +490,12 @@
                 <w:sz w:val="16"/>
               </w:rPr>
             </w:pPr>
-            <w:proofErr w:type="spellStart"/>
-            <w:r>
-              <w:rPr>
-                <w:color w:val="000000" w:themeColor="text1"/>
-                <w:sz w:val="16"/>
-              </w:rPr>
-              <w:t>clientcare</w:t>
-            </w:r>
-            <w:proofErr w:type="spellEnd"/>
-            <w:r>
-              <w:rPr>
-                <w:color w:val="000000" w:themeColor="text1"/>
-                <w:sz w:val="16"/>
-              </w:rPr>
-              <w:t>-agent</w:t>
+            <w:r>
+              <w:rPr>
+                <w:color w:val="000000" w:themeColor="text1"/>
+                <w:sz w:val="16"/>
+              </w:rPr>
+              <w:t>clientcare-agent</w:t>
             </w:r>
           </w:p>
           <w:p>
@@ -542,7 +515,6 @@
                 <w:sz w:val="16"/>
               </w:rPr>
             </w:pPr>
-            <w:proofErr w:type="spellStart"/>
             <w:r>
               <w:rPr>
                 <w:color w:val="000000" w:themeColor="text1"/>
@@ -550,7 +522,6 @@
               </w:rPr>
               <w:t>clientcare-teamleader</w:t>
             </w:r>
-            <w:proofErr w:type="spellEnd"/>
           </w:p>
           <w:p>
             <w:pPr>
@@ -569,21 +540,12 @@
                 <w:sz w:val="16"/>
               </w:rPr>
             </w:pPr>
-            <w:proofErr w:type="spellStart"/>
-            <w:r>
-              <w:rPr>
-                <w:color w:val="000000" w:themeColor="text1"/>
-                <w:sz w:val="16"/>
-              </w:rPr>
-              <w:t>clientcare</w:t>
-            </w:r>
-            <w:proofErr w:type="spellEnd"/>
-            <w:r>
-              <w:rPr>
-                <w:color w:val="000000" w:themeColor="text1"/>
-                <w:sz w:val="16"/>
-              </w:rPr>
-              <w:t>-manager</w:t>
+            <w:r>
+              <w:rPr>
+                <w:color w:val="000000" w:themeColor="text1"/>
+                <w:sz w:val="16"/>
+              </w:rPr>
+              <w:t>clientcare-manager</w:t>
             </w:r>
           </w:p>
           <w:p>
@@ -603,21 +565,12 @@
                 <w:sz w:val="16"/>
               </w:rPr>
             </w:pPr>
-            <w:proofErr w:type="spellStart"/>
-            <w:r>
-              <w:rPr>
-                <w:color w:val="000000" w:themeColor="text1"/>
-                <w:sz w:val="16"/>
-              </w:rPr>
-              <w:t>clientcareadmin</w:t>
-            </w:r>
-            <w:proofErr w:type="spellEnd"/>
-            <w:r>
-              <w:rPr>
-                <w:color w:val="000000" w:themeColor="text1"/>
-                <w:sz w:val="16"/>
-              </w:rPr>
-              <w:t>-agent</w:t>
+            <w:r>
+              <w:rPr>
+                <w:color w:val="000000" w:themeColor="text1"/>
+                <w:sz w:val="16"/>
+              </w:rPr>
+              <w:t>clientcareadmin-agent</w:t>
             </w:r>
           </w:p>
           <w:p>
@@ -637,7 +590,6 @@
                 <w:sz w:val="16"/>
               </w:rPr>
             </w:pPr>
-            <w:proofErr w:type="spellStart"/>
             <w:r>
               <w:rPr>
                 <w:color w:val="000000" w:themeColor="text1"/>
@@ -645,7 +597,6 @@
               </w:rPr>
               <w:t>clientcareadmin-teamleader</w:t>
             </w:r>
-            <w:proofErr w:type="spellEnd"/>
           </w:p>
           <w:p>
             <w:pPr>
@@ -664,21 +615,12 @@
                 <w:sz w:val="16"/>
               </w:rPr>
             </w:pPr>
-            <w:proofErr w:type="spellStart"/>
-            <w:r>
-              <w:rPr>
-                <w:color w:val="000000" w:themeColor="text1"/>
-                <w:sz w:val="16"/>
-              </w:rPr>
-              <w:t>clientcareadmin</w:t>
-            </w:r>
-            <w:proofErr w:type="spellEnd"/>
-            <w:r>
-              <w:rPr>
-                <w:color w:val="000000" w:themeColor="text1"/>
-                <w:sz w:val="16"/>
-              </w:rPr>
-              <w:t>-manager</w:t>
+            <w:r>
+              <w:rPr>
+                <w:color w:val="000000" w:themeColor="text1"/>
+                <w:sz w:val="16"/>
+              </w:rPr>
+              <w:t>clientcareadmin-manager</w:t>
             </w:r>
           </w:p>
         </w:tc>
@@ -814,16 +756,271 @@
               </w:rPr>
               <w:t>/clientcare/favourites/v1/landing</w:t>
             </w:r>
-            <w:bookmarkStart w:id="0" w:name="_GoBack"/>
-            <w:bookmarkEnd w:id="0"/>
-          </w:p>
-          <w:p>
-            <w:pPr>
-              <w:rPr>
-                <w:color w:val="000000" w:themeColor="text1"/>
-                <w:sz w:val="16"/>
-              </w:rPr>
-            </w:pPr>
+          </w:p>
+          <w:p>
+            <w:pPr>
+              <w:rPr>
+                <w:color w:val="000000" w:themeColor="text1"/>
+                <w:sz w:val="16"/>
+              </w:rPr>
+            </w:pPr>
+          </w:p>
+          <w:p>
+            <w:pPr>
+              <w:rPr>
+                <w:color w:val="000000" w:themeColor="text1"/>
+                <w:sz w:val="16"/>
+              </w:rPr>
+            </w:pPr>
+            <w:r>
+              <w:rPr>
+                <w:color w:val="000000" w:themeColor="text1"/>
+                <w:sz w:val="16"/>
+              </w:rPr>
+              <w:t>Screen Inputs:</w:t>
+            </w:r>
+          </w:p>
+          <w:p>
+            <w:pPr>
+              <w:pStyle w:val="ListParagraph"/>
+              <w:numPr>
+                <w:ilvl w:val="0"/>
+                <w:numId w:val="3"/>
+              </w:numPr>
+              <w:rPr>
+                <w:color w:val="000000" w:themeColor="text1"/>
+                <w:sz w:val="16"/>
+              </w:rPr>
+            </w:pPr>
+            <w:r>
+              <w:rPr>
+                <w:color w:val="000000" w:themeColor="text1"/>
+                <w:sz w:val="16"/>
+              </w:rPr>
+              <w:t xml:space="preserve">Caller Information </w:t>
+            </w:r>
+          </w:p>
+          <w:p>
+            <w:pPr>
+              <w:pStyle w:val="ListParagraph"/>
+              <w:numPr>
+                <w:ilvl w:val="1"/>
+                <w:numId w:val="3"/>
+              </w:numPr>
+              <w:rPr>
+                <w:color w:val="000000" w:themeColor="text1"/>
+                <w:sz w:val="16"/>
+              </w:rPr>
+            </w:pPr>
+            <w:r>
+              <w:rPr>
+                <w:color w:val="000000" w:themeColor="text1"/>
+                <w:sz w:val="16"/>
+              </w:rPr>
+              <w:t>From state</w:t>
+            </w:r>
+          </w:p>
+          <w:p>
+            <w:pPr>
+              <w:pStyle w:val="ListParagraph"/>
+              <w:numPr>
+                <w:ilvl w:val="0"/>
+                <w:numId w:val="3"/>
+              </w:numPr>
+              <w:rPr>
+                <w:color w:val="000000" w:themeColor="text1"/>
+                <w:sz w:val="16"/>
+              </w:rPr>
+            </w:pPr>
+            <w:r>
+              <w:rPr>
+                <w:color w:val="000000" w:themeColor="text1"/>
+                <w:sz w:val="16"/>
+              </w:rPr>
+              <w:t>Incoming Call Details</w:t>
+            </w:r>
+          </w:p>
+          <w:p>
+            <w:pPr>
+              <w:pStyle w:val="ListParagraph"/>
+              <w:numPr>
+                <w:ilvl w:val="1"/>
+                <w:numId w:val="3"/>
+              </w:numPr>
+              <w:rPr>
+                <w:color w:val="000000" w:themeColor="text1"/>
+                <w:sz w:val="16"/>
+              </w:rPr>
+            </w:pPr>
+            <w:r>
+              <w:rPr>
+                <w:color w:val="000000" w:themeColor="text1"/>
+                <w:sz w:val="16"/>
+              </w:rPr>
+              <w:t>From state</w:t>
+            </w:r>
+          </w:p>
+          <w:p>
+            <w:pPr>
+              <w:pStyle w:val="ListParagraph"/>
+              <w:numPr>
+                <w:ilvl w:val="0"/>
+                <w:numId w:val="3"/>
+              </w:numPr>
+              <w:rPr>
+                <w:color w:val="000000" w:themeColor="text1"/>
+                <w:sz w:val="16"/>
+              </w:rPr>
+            </w:pPr>
+            <w:r>
+              <w:rPr>
+                <w:color w:val="000000" w:themeColor="text1"/>
+                <w:sz w:val="16"/>
+              </w:rPr>
+              <w:t>Verification Status</w:t>
+            </w:r>
+          </w:p>
+          <w:p>
+            <w:pPr>
+              <w:pStyle w:val="ListParagraph"/>
+              <w:numPr>
+                <w:ilvl w:val="1"/>
+                <w:numId w:val="3"/>
+              </w:numPr>
+              <w:rPr>
+                <w:color w:val="000000" w:themeColor="text1"/>
+                <w:sz w:val="16"/>
+              </w:rPr>
+            </w:pPr>
+            <w:r>
+              <w:rPr>
+                <w:color w:val="000000" w:themeColor="text1"/>
+                <w:sz w:val="16"/>
+              </w:rPr>
+              <w:t>From state</w:t>
+            </w:r>
+          </w:p>
+          <w:p>
+            <w:pPr>
+              <w:pStyle w:val="ListParagraph"/>
+              <w:numPr>
+                <w:ilvl w:val="0"/>
+                <w:numId w:val="3"/>
+              </w:numPr>
+              <w:rPr>
+                <w:color w:val="000000" w:themeColor="text1"/>
+                <w:sz w:val="16"/>
+              </w:rPr>
+            </w:pPr>
+            <w:r>
+              <w:rPr>
+                <w:color w:val="000000" w:themeColor="text1"/>
+                <w:sz w:val="16"/>
+              </w:rPr>
+              <w:t>Landing Page data</w:t>
+            </w:r>
+          </w:p>
+          <w:p>
+            <w:pPr>
+              <w:pStyle w:val="ListParagraph"/>
+              <w:ind w:left="1080"/>
+              <w:rPr>
+                <w:color w:val="000000" w:themeColor="text1"/>
+                <w:sz w:val="16"/>
+              </w:rPr>
+            </w:pPr>
+          </w:p>
+          <w:p>
+            <w:pPr>
+              <w:rPr>
+                <w:color w:val="000000" w:themeColor="text1"/>
+                <w:sz w:val="16"/>
+              </w:rPr>
+            </w:pPr>
+            <w:r>
+              <w:rPr>
+                <w:color w:val="000000" w:themeColor="text1"/>
+                <w:sz w:val="16"/>
+              </w:rPr>
+              <w:t>Screen Outputs</w:t>
+            </w:r>
+          </w:p>
+          <w:p>
+            <w:pPr>
+              <w:pStyle w:val="ListParagraph"/>
+              <w:numPr>
+                <w:ilvl w:val="0"/>
+                <w:numId w:val="4"/>
+              </w:numPr>
+              <w:rPr>
+                <w:color w:val="000000" w:themeColor="text1"/>
+                <w:sz w:val="16"/>
+              </w:rPr>
+            </w:pPr>
+            <w:r>
+              <w:rPr>
+                <w:color w:val="000000" w:themeColor="text1"/>
+                <w:sz w:val="16"/>
+              </w:rPr>
+              <w:t>Verify Clicked</w:t>
+            </w:r>
+            <w:r>
+              <w:rPr>
+                <w:color w:val="000000" w:themeColor="text1"/>
+                <w:sz w:val="16"/>
+              </w:rPr>
+              <w:t xml:space="preserve"> – To verify an unverified client, starts verification flow</w:t>
+            </w:r>
+          </w:p>
+          <w:p>
+            <w:pPr>
+              <w:pStyle w:val="ListParagraph"/>
+              <w:numPr>
+                <w:ilvl w:val="0"/>
+                <w:numId w:val="4"/>
+              </w:numPr>
+              <w:rPr>
+                <w:color w:val="000000" w:themeColor="text1"/>
+                <w:sz w:val="16"/>
+              </w:rPr>
+            </w:pPr>
+            <w:r>
+              <w:rPr>
+                <w:color w:val="000000" w:themeColor="text1"/>
+                <w:sz w:val="16"/>
+              </w:rPr>
+              <w:t>Option Clicked</w:t>
+            </w:r>
+            <w:r>
+              <w:rPr>
+                <w:color w:val="000000" w:themeColor="text1"/>
+                <w:sz w:val="16"/>
+              </w:rPr>
+              <w:t xml:space="preserve"> – Starts the flow for whichever option was clicked (stop card, debicheck etc.)</w:t>
+            </w:r>
+          </w:p>
+          <w:p>
+            <w:pPr>
+              <w:rPr>
+                <w:color w:val="000000" w:themeColor="text1"/>
+                <w:sz w:val="16"/>
+              </w:rPr>
+            </w:pPr>
+          </w:p>
+          <w:p>
+            <w:pPr>
+              <w:rPr>
+                <w:color w:val="000000" w:themeColor="text1"/>
+                <w:sz w:val="16"/>
+              </w:rPr>
+            </w:pPr>
+            <w:r>
+              <w:rPr>
+                <w:color w:val="000000" w:themeColor="text1"/>
+                <w:sz w:val="16"/>
+              </w:rPr>
+              <w:t>Screen heavily dependent on state, see supporting doc links for documentation</w:t>
+            </w:r>
           </w:p>
           <w:p>
             <w:pPr>
@@ -998,15 +1195,13 @@
                 <w:sz w:val="16"/>
               </w:rPr>
             </w:pPr>
-            <w:proofErr w:type="spellStart"/>
-            <w:r>
-              <w:rPr>
-                <w:color w:val="000000" w:themeColor="text1"/>
-                <w:sz w:val="16"/>
-              </w:rPr>
-              <w:t>OpenAPI</w:t>
-            </w:r>
-            <w:proofErr w:type="spellEnd"/>
+            <w:r>
+              <w:rPr>
+                <w:color w:val="000000" w:themeColor="text1"/>
+                <w:sz w:val="16"/>
+              </w:rPr>
+              <w:t>Screen</w:t>
+            </w:r>
           </w:p>
         </w:tc>
         <w:tc>
@@ -1015,13 +1210,103 @@
             <w:gridSpan w:val="3"/>
           </w:tcPr>
           <w:p>
-            <w:pPr>
-              <w:rPr>
-                <w:color w:val="000000" w:themeColor="text1"/>
-                <w:sz w:val="16"/>
-              </w:rPr>
-            </w:pPr>
-            <w:hyperlink r:id="rId12" w:history="1">
+            <w:r>
+              <w:rPr>
+                <w:noProof/>
+              </w:rPr>
+              <w:drawing>
+                <wp:inline distT="0" distB="0" distL="0" distR="0" wp14:anchorId="3EC5D5E5" wp14:editId="6A70EAF5">
+                  <wp:extent cx="4265011" cy="3717415"/>
+                  <wp:effectExtent l="0" t="0" r="2540" b="0"/>
+                  <wp:docPr id="1" name="Picture 1"/>
+                  <wp:cNvGraphicFramePr>
+                    <a:graphicFrameLocks xmlns:a="http://schemas.openxmlformats.org/drawingml/2006/main" noChangeAspect="1"/>
+                  </wp:cNvGraphicFramePr>
+                  <a:graphic xmlns:a="http://schemas.openxmlformats.org/drawingml/2006/main">
+                    <a:graphicData uri="http://schemas.openxmlformats.org/drawingml/2006/picture">
+                      <pic:pic xmlns:pic="http://schemas.openxmlformats.org/drawingml/2006/picture">
+                        <pic:nvPicPr>
+                          <pic:cNvPr id="1" name=""/>
+                          <pic:cNvPicPr/>
+                        </pic:nvPicPr>
+                        <pic:blipFill>
+                          <a:blip r:embed="rId12"/>
+                          <a:stretch>
+                            <a:fillRect/>
+                          </a:stretch>
+                        </pic:blipFill>
+                        <pic:spPr>
+                          <a:xfrm>
+                            <a:off x="0" y="0"/>
+                            <a:ext cx="4294977" cy="3743534"/>
+                          </a:xfrm>
+                          <a:prstGeom prst="rect">
+                            <a:avLst/>
+                          </a:prstGeom>
+                        </pic:spPr>
+                      </pic:pic>
+                    </a:graphicData>
+                  </a:graphic>
+                </wp:inline>
+              </w:drawing>
+            </w:r>
+          </w:p>
+        </w:tc>
+      </w:tr>
+      <w:tr>
+        <w:trPr>
+          <w:trHeight w:val="147"/>
+        </w:trPr>
+        <w:tc>
+          <w:tcPr>
+            <w:tcW w:w="1130" w:type="pct"/>
+            <w:vMerge/>
+            <w:shd w:val="clear" w:color="auto" w:fill="D9D9D9" w:themeFill="background1" w:themeFillShade="D9"/>
+          </w:tcPr>
+          <w:p>
+            <w:pPr>
+              <w:rPr>
+                <w:b/>
+                <w:color w:val="000000" w:themeColor="text1"/>
+                <w:sz w:val="16"/>
+                <w:highlight w:val="lightGray"/>
+              </w:rPr>
+            </w:pPr>
+          </w:p>
+        </w:tc>
+        <w:tc>
+          <w:tcPr>
+            <w:tcW w:w="610" w:type="pct"/>
+          </w:tcPr>
+          <w:p>
+            <w:pPr>
+              <w:rPr>
+                <w:color w:val="000000" w:themeColor="text1"/>
+                <w:sz w:val="16"/>
+              </w:rPr>
+            </w:pPr>
+            <w:r>
+              <w:rPr>
+                <w:color w:val="000000" w:themeColor="text1"/>
+                <w:sz w:val="16"/>
+              </w:rPr>
+              <w:t>OpenAPI</w:t>
+            </w:r>
+          </w:p>
+        </w:tc>
+        <w:tc>
+          <w:tcPr>
+            <w:tcW w:w="3260" w:type="pct"/>
+            <w:gridSpan w:val="3"/>
+          </w:tcPr>
+          <w:p>
+            <w:pPr>
+              <w:rPr>
+                <w:color w:val="000000" w:themeColor="text1"/>
+                <w:sz w:val="16"/>
+              </w:rPr>
+            </w:pPr>
+            <w:hyperlink r:id="rId13" w:history="1">
               <w:r>
                 <w:rPr>
                   <w:rStyle w:val="Hyperlink"/>
@@ -1073,6 +1358,111 @@
                 <w:sz w:val="16"/>
               </w:rPr>
             </w:pPr>
+            <w:r>
+              <w:rPr>
+                <w:color w:val="000000" w:themeColor="text1"/>
+                <w:sz w:val="16"/>
+              </w:rPr>
+              <w:t>State Object Description</w:t>
+            </w:r>
+          </w:p>
+        </w:tc>
+        <w:tc>
+          <w:tcPr>
+            <w:tcW w:w="3260" w:type="pct"/>
+            <w:gridSpan w:val="3"/>
+          </w:tcPr>
+          <w:p>
+            <w:pPr>
+              <w:rPr>
+                <w:color w:val="000000" w:themeColor="text1"/>
+                <w:sz w:val="16"/>
+              </w:rPr>
+            </w:pPr>
+            <w:hyperlink r:id="rId14" w:history="1">
+              <w:r>
+                <w:rPr>
+                  <w:rStyle w:val="Hyperlink"/>
+                  <w:sz w:val="16"/>
+                </w:rPr>
+                <w:t>https://confluence.capitecbank.co.za:8443/x/2QcwFw</w:t>
+              </w:r>
+            </w:hyperlink>
+            <w:r>
+              <w:rPr>
+                <w:color w:val="000000" w:themeColor="text1"/>
+                <w:sz w:val="16"/>
+              </w:rPr>
+              <w:t xml:space="preserve"> </w:t>
+            </w:r>
+          </w:p>
+          <w:p>
+            <w:pPr>
+              <w:rPr>
+                <w:color w:val="000000" w:themeColor="text1"/>
+                <w:sz w:val="16"/>
+              </w:rPr>
+            </w:pPr>
+            <w:bookmarkStart w:id="0" w:name="_GoBack"/>
+            <w:bookmarkEnd w:id="0"/>
+          </w:p>
+          <w:p>
+            <w:pPr>
+              <w:rPr>
+                <w:color w:val="000000" w:themeColor="text1"/>
+                <w:sz w:val="16"/>
+              </w:rPr>
+            </w:pPr>
+            <w:hyperlink r:id="rId15" w:history="1">
+              <w:r>
+                <w:rPr>
+                  <w:rStyle w:val="Hyperlink"/>
+                  <w:sz w:val="16"/>
+                </w:rPr>
+                <w:t>http://cb0218:8080/tfs/CapitecBank/BSC%20Components/_git/Capitec.BSC.Horizon.UI?path=%2Fsrc%2Fstore%2FHorizonStore.js&amp;version=GBdevelop</w:t>
+              </w:r>
+            </w:hyperlink>
+            <w:r>
+              <w:rPr>
+                <w:color w:val="000000" w:themeColor="text1"/>
+                <w:sz w:val="16"/>
+              </w:rPr>
+              <w:t xml:space="preserve"> </w:t>
+            </w:r>
+          </w:p>
+        </w:tc>
+      </w:tr>
+      <w:tr>
+        <w:trPr>
+          <w:trHeight w:val="147"/>
+        </w:trPr>
+        <w:tc>
+          <w:tcPr>
+            <w:tcW w:w="1130" w:type="pct"/>
+            <w:shd w:val="clear" w:color="auto" w:fill="D9D9D9" w:themeFill="background1" w:themeFillShade="D9"/>
+          </w:tcPr>
+          <w:p>
+            <w:pPr>
+              <w:rPr>
+                <w:b/>
+                <w:color w:val="000000" w:themeColor="text1"/>
+                <w:sz w:val="16"/>
+                <w:highlight w:val="lightGray"/>
+              </w:rPr>
+            </w:pPr>
+          </w:p>
+        </w:tc>
+        <w:tc>
+          <w:tcPr>
+            <w:tcW w:w="610" w:type="pct"/>
+          </w:tcPr>
+          <w:p>
+            <w:pPr>
+              <w:rPr>
+                <w:color w:val="000000" w:themeColor="text1"/>
+                <w:sz w:val="16"/>
+              </w:rPr>
+            </w:pPr>
           </w:p>
         </w:tc>
         <w:tc>
@@ -1779,8 +2169,8 @@
     </w:tbl>
     <w:p/>
     <w:sectPr>
-      <w:headerReference w:type="default" r:id="rId13"/>
-      <w:footerReference w:type="default" r:id="rId14"/>
+      <w:headerReference w:type="default" r:id="rId16"/>
+      <w:footerReference w:type="default" r:id="rId17"/>
       <w:pgSz w:w="11906" w:h="16838"/>
       <w:pgMar w:top="1440" w:right="1440" w:bottom="1440" w:left="1440" w:header="708" w:footer="708" w:gutter="0"/>
       <w:cols w:space="708"/>
@@ -1984,9 +2374,122 @@
 <file path=word/numbering.xml><?xml version="1.0" encoding="utf-8"?>
 <w:numbering xmlns:wpc="http://schemas.microsoft.com/office/word/2010/wordprocessingCanvas" xmlns:cx="http://schemas.microsoft.com/office/drawing/2014/chartex" xmlns:cx1="http://schemas.microsoft.com/office/drawing/2015/9/8/chartex" xmlns:mc="http://schemas.openxmlformats.org/markup-compatibility/2006" xmlns:o="urn:schemas-microsoft-com:office:office" xmlns:r="http://schemas.openxmlformats.org/officeDocument/2006/relationships" xmlns:m="http://schemas.openxmlformats.org/officeDocument/2006/math" xmlns:v="urn:schemas-microsoft-com:vml" xmlns:wp14="http://schemas.microsoft.com/office/word/2010/wordprocessingDrawing" xmlns:wp="http://schemas.openxmlformats.org/drawingml/2006/wordprocessingDrawing" xmlns:w10="urn:schemas-microsoft-com:office:word" xmlns:w="http://schemas.openxmlformats.org/wordprocessingml/2006/main" xmlns:w14="http://schemas.microsoft.com/office/word/2010/wordml" xmlns:w15="http://schemas.microsoft.com/office/word/2012/wordml" xmlns:w16se="http://schemas.microsoft.com/office/word/2015/wordml/symex" xmlns:wpg="http://schemas.microsoft.com/office/word/2010/wordprocessingGroup" xmlns:wpi="http://schemas.microsoft.com/office/word/2010/wordprocessingInk" xmlns:wne="http://schemas.microsoft.com/office/word/2006/wordml" xmlns:wps="http://schemas.microsoft.com/office/word/2010/wordprocessingShape" mc:Ignorable="w14 w15 w16se wp14">
   <w:abstractNum w:abstractNumId="0" w15:restartNumberingAfterBreak="0">
+    <w:nsid w:val="1EB7135D"/>
+    <w:multiLevelType w:val="hybridMultilevel"/>
+    <w:tmpl w:val="198C805C"/>
+    <w:lvl w:ilvl="0" w:tplc="1C090001">
+      <w:start w:val="1"/>
+      <w:numFmt w:val="bullet"/>
+      <w:lvlText w:val=""/>
+      <w:lvlJc w:val="left"/>
+      <w:pPr>
+        <w:ind w:left="720" w:hanging="360"/>
+      </w:pPr>
+      <w:rPr>
+        <w:rFonts w:ascii="Symbol" w:hAnsi="Symbol" w:hint="default"/>
+      </w:rPr>
+    </w:lvl>
+    <w:lvl w:ilvl="1" w:tplc="1C090003" w:tentative="1">
+      <w:start w:val="1"/>
+      <w:numFmt w:val="bullet"/>
+      <w:lvlText w:val="o"/>
+      <w:lvlJc w:val="left"/>
+      <w:pPr>
+        <w:ind w:left="1440" w:hanging="360"/>
+      </w:pPr>
+      <w:rPr>
+        <w:rFonts w:ascii="Courier New" w:hAnsi="Courier New" w:cs="Courier New" w:hint="default"/>
+      </w:rPr>
+    </w:lvl>
+    <w:lvl w:ilvl="2" w:tplc="1C090005" w:tentative="1">
+      <w:start w:val="1"/>
+      <w:numFmt w:val="bullet"/>
+      <w:lvlText w:val=""/>
+      <w:lvlJc w:val="left"/>
+      <w:pPr>
+        <w:ind w:left="2160" w:hanging="360"/>
+      </w:pPr>
+      <w:rPr>
+        <w:rFonts w:ascii="Wingdings" w:hAnsi="Wingdings" w:hint="default"/>
+      </w:rPr>
+    </w:lvl>
+    <w:lvl w:ilvl="3" w:tplc="1C090001" w:tentative="1">
+      <w:start w:val="1"/>
+      <w:numFmt w:val="bullet"/>
+      <w:lvlText w:val=""/>
+      <w:lvlJc w:val="left"/>
+      <w:pPr>
+        <w:ind w:left="2880" w:hanging="360"/>
+      </w:pPr>
+      <w:rPr>
+        <w:rFonts w:ascii="Symbol" w:hAnsi="Symbol" w:hint="default"/>
+      </w:rPr>
+    </w:lvl>
+    <w:lvl w:ilvl="4" w:tplc="1C090003" w:tentative="1">
+      <w:start w:val="1"/>
+      <w:numFmt w:val="bullet"/>
+      <w:lvlText w:val="o"/>
+      <w:lvlJc w:val="left"/>
+      <w:pPr>
+        <w:ind w:left="3600" w:hanging="360"/>
+      </w:pPr>
+      <w:rPr>
+        <w:rFonts w:ascii="Courier New" w:hAnsi="Courier New" w:cs="Courier New" w:hint="default"/>
+      </w:rPr>
+    </w:lvl>
+    <w:lvl w:ilvl="5" w:tplc="1C090005" w:tentative="1">
+      <w:start w:val="1"/>
+      <w:numFmt w:val="bullet"/>
+      <w:lvlText w:val=""/>
+      <w:lvlJc w:val="left"/>
+      <w:pPr>
+        <w:ind w:left="4320" w:hanging="360"/>
+      </w:pPr>
+      <w:rPr>
+        <w:rFonts w:ascii="Wingdings" w:hAnsi="Wingdings" w:hint="default"/>
+      </w:rPr>
+    </w:lvl>
+    <w:lvl w:ilvl="6" w:tplc="1C090001" w:tentative="1">
+      <w:start w:val="1"/>
+      <w:numFmt w:val="bullet"/>
+      <w:lvlText w:val=""/>
+      <w:lvlJc w:val="left"/>
+      <w:pPr>
+        <w:ind w:left="5040" w:hanging="360"/>
+      </w:pPr>
+      <w:rPr>
+        <w:rFonts w:ascii="Symbol" w:hAnsi="Symbol" w:hint="default"/>
+      </w:rPr>
+    </w:lvl>
+    <w:lvl w:ilvl="7" w:tplc="1C090003" w:tentative="1">
+      <w:start w:val="1"/>
+      <w:numFmt w:val="bullet"/>
+      <w:lvlText w:val="o"/>
+      <w:lvlJc w:val="left"/>
+      <w:pPr>
+        <w:ind w:left="5760" w:hanging="360"/>
+      </w:pPr>
+      <w:rPr>
+        <w:rFonts w:ascii="Courier New" w:hAnsi="Courier New" w:cs="Courier New" w:hint="default"/>
+      </w:rPr>
+    </w:lvl>
+    <w:lvl w:ilvl="8" w:tplc="1C090005" w:tentative="1">
+      <w:start w:val="1"/>
+      <w:numFmt w:val="bullet"/>
+      <w:lvlText w:val=""/>
+      <w:lvlJc w:val="left"/>
+      <w:pPr>
+        <w:ind w:left="6480" w:hanging="360"/>
+      </w:pPr>
+      <w:rPr>
+        <w:rFonts w:ascii="Wingdings" w:hAnsi="Wingdings" w:hint="default"/>
+      </w:rPr>
+    </w:lvl>
+  </w:abstractNum>
+  <w:abstractNum w:abstractNumId="1" w15:restartNumberingAfterBreak="0">
     <w:nsid w:val="558055C3"/>
     <w:multiLevelType w:val="hybridMultilevel"/>
-    <w:tmpl w:val="9D986538"/>
+    <w:tmpl w:val="CF4662E4"/>
     <w:lvl w:ilvl="0" w:tplc="1C090001">
       <w:start w:val="1"/>
       <w:numFmt w:val="bullet"/>
@@ -1999,7 +2502,7 @@
         <w:rFonts w:ascii="Symbol" w:hAnsi="Symbol" w:hint="default"/>
       </w:rPr>
     </w:lvl>
-    <w:lvl w:ilvl="1" w:tplc="1C090003" w:tentative="1">
+    <w:lvl w:ilvl="1" w:tplc="1C090003">
       <w:start w:val="1"/>
       <w:numFmt w:val="bullet"/>
       <w:lvlText w:val="o"/>
@@ -2096,7 +2599,7 @@
       </w:rPr>
     </w:lvl>
   </w:abstractNum>
-  <w:abstractNum w:abstractNumId="1" w15:restartNumberingAfterBreak="0">
+  <w:abstractNum w:abstractNumId="2" w15:restartNumberingAfterBreak="0">
     <w:nsid w:val="713E1E50"/>
     <w:multiLevelType w:val="hybridMultilevel"/>
     <w:tmpl w:val="25E411BA"/>
@@ -2209,7 +2712,7 @@
       </w:rPr>
     </w:lvl>
   </w:abstractNum>
-  <w:abstractNum w:abstractNumId="2" w15:restartNumberingAfterBreak="0">
+  <w:abstractNum w:abstractNumId="3" w15:restartNumberingAfterBreak="0">
     <w:nsid w:val="77D61A5D"/>
     <w:multiLevelType w:val="hybridMultilevel"/>
     <w:tmpl w:val="21BEE3D8"/>
@@ -2323,12 +2826,15 @@
     </w:lvl>
   </w:abstractNum>
   <w:num w:numId="1">
+    <w:abstractNumId w:val="2"/>
+  </w:num>
+  <w:num w:numId="2">
+    <w:abstractNumId w:val="3"/>
+  </w:num>
+  <w:num w:numId="3">
     <w:abstractNumId w:val="1"/>
   </w:num>
-  <w:num w:numId="2">
-    <w:abstractNumId w:val="2"/>
-  </w:num>
-  <w:num w:numId="3">
+  <w:num w:numId="4">
     <w:abstractNumId w:val="0"/>
   </w:num>
 </w:numbering>
@@ -3155,12 +3661,9 @@
 </file>
 
 <file path=customXml/item1.xml><?xml version="1.0" encoding="utf-8"?>
-<?mso-contentType ?>
-<FormTemplates xmlns="http://schemas.microsoft.com/sharepoint/v3/contenttype/forms">
-  <Display>DocumentLibraryForm</Display>
-  <Edit>DocumentLibraryForm</Edit>
-  <New>DocumentLibraryForm</New>
-</FormTemplates>
+<p:properties xmlns:p="http://schemas.microsoft.com/office/2006/metadata/properties" xmlns:xsi="http://www.w3.org/2001/XMLSchema-instance" xmlns:pc="http://schemas.microsoft.com/office/infopath/2007/PartnerControls">
+  <documentManagement/>
+</p:properties>
 </file>
 
 <file path=customXml/item2.xml><?xml version="1.0" encoding="utf-8"?>
@@ -3375,9 +3878,12 @@
 </file>
 
 <file path=customXml/item3.xml><?xml version="1.0" encoding="utf-8"?>
-<p:properties xmlns:p="http://schemas.microsoft.com/office/2006/metadata/properties" xmlns:xsi="http://www.w3.org/2001/XMLSchema-instance" xmlns:pc="http://schemas.microsoft.com/office/infopath/2007/PartnerControls">
-  <documentManagement/>
-</p:properties>
+<?mso-contentType ?>
+<FormTemplates xmlns="http://schemas.microsoft.com/sharepoint/v3/contenttype/forms">
+  <Display>DocumentLibraryForm</Display>
+  <Edit>DocumentLibraryForm</Edit>
+  <New>DocumentLibraryForm</New>
+</FormTemplates>
 </file>
 
 <file path=customXml/item4.xml><?xml version="1.0" encoding="utf-8"?>
@@ -3385,9 +3891,10 @@
 </file>
 
 <file path=customXml/itemProps1.xml><?xml version="1.0" encoding="utf-8"?>
-<ds:datastoreItem xmlns:ds="http://schemas.openxmlformats.org/officeDocument/2006/customXml" ds:itemID="{94A85ECC-E0D6-4938-810E-9C17484C5B99}">
+<ds:datastoreItem xmlns:ds="http://schemas.openxmlformats.org/officeDocument/2006/customXml" ds:itemID="{061A2DAF-A040-437A-96A3-0B7E92C42B11}">
   <ds:schemaRefs>
-    <ds:schemaRef ds:uri="http://schemas.microsoft.com/sharepoint/v3/contenttype/forms"/>
+    <ds:schemaRef ds:uri="http://schemas.microsoft.com/office/2006/metadata/properties"/>
+    <ds:schemaRef ds:uri="http://schemas.microsoft.com/office/infopath/2007/PartnerControls"/>
   </ds:schemaRefs>
 </ds:datastoreItem>
 </file>
@@ -3412,16 +3919,15 @@
 </file>
 
 <file path=customXml/itemProps3.xml><?xml version="1.0" encoding="utf-8"?>
-<ds:datastoreItem xmlns:ds="http://schemas.openxmlformats.org/officeDocument/2006/customXml" ds:itemID="{061A2DAF-A040-437A-96A3-0B7E92C42B11}">
+<ds:datastoreItem xmlns:ds="http://schemas.openxmlformats.org/officeDocument/2006/customXml" ds:itemID="{94A85ECC-E0D6-4938-810E-9C17484C5B99}">
   <ds:schemaRefs>
-    <ds:schemaRef ds:uri="http://schemas.microsoft.com/office/2006/metadata/properties"/>
-    <ds:schemaRef ds:uri="http://schemas.microsoft.com/office/infopath/2007/PartnerControls"/>
+    <ds:schemaRef ds:uri="http://schemas.microsoft.com/sharepoint/v3/contenttype/forms"/>
   </ds:schemaRefs>
 </ds:datastoreItem>
 </file>
 
 <file path=customXml/itemProps4.xml><?xml version="1.0" encoding="utf-8"?>
-<ds:datastoreItem xmlns:ds="http://schemas.openxmlformats.org/officeDocument/2006/customXml" ds:itemID="{656829E0-984D-47BB-B698-FD24C1A24F4F}">
+<ds:datastoreItem xmlns:ds="http://schemas.openxmlformats.org/officeDocument/2006/customXml" ds:itemID="{8FB63C3C-8AD6-4DB2-8407-ACD574CAABE7}">
   <ds:schemaRefs>
     <ds:schemaRef ds:uri="http://schemas.openxmlformats.org/officeDocument/2006/bibliography"/>
   </ds:schemaRefs>

</xml_diff>